<commit_message>
feat: add weekly report for period 3 and documentation for grading skill
</commit_message>
<xml_diff>
--- a/Messages/semaine3.docx
+++ b/Messages/semaine3.docx
@@ -4081,7 +4081,251 @@
           <w:i/>
           <w:iCs/>
         </w:rPr>
-        <w:t>(je suis juste en retard mais je m'y remets aujourd'hui)</w:t>
+        <w:t>(</w:t>
+      </w:r>
+      <w:proofErr w:type="gramStart"/>
+      <w:r>
+        <w:rPr>
+          <w:i/>
+          <w:iCs/>
+        </w:rPr>
+        <w:t>je</w:t>
+      </w:r>
+      <w:proofErr w:type="gramEnd"/>
+      <w:r>
+        <w:rPr>
+          <w:i/>
+          <w:iCs/>
+        </w:rPr>
+        <w:t xml:space="preserve"> suis juste en retard mais je m'y remets aujourd'hui)</w:t>
+      </w:r>
+    </w:p>
+    <w:p>
+      <w:pPr>
+        <w:spacing w:after="0"/>
+      </w:pPr>
+    </w:p>
+    <w:p>
+      <w:pPr>
+        <w:spacing w:after="0"/>
+      </w:pPr>
+    </w:p>
+    <w:p>
+      <w:pPr>
+        <w:spacing w:after="0"/>
+      </w:pPr>
+    </w:p>
+    <w:p>
+      <w:pPr>
+        <w:spacing w:after="0"/>
+        <w:rPr>
+          <w:rFonts w:ascii="Segoe UI Emoji" w:hAnsi="Segoe UI Emoji" w:cs="Segoe UI Emoji"/>
+        </w:rPr>
+      </w:pPr>
+      <w:r>
+        <w:t xml:space="preserve">Bonjour à toutes et à tous ! </w:t>
+      </w:r>
+      <w:r>
+        <w:rPr>
+          <w:rFonts w:ascii="Segoe UI Emoji" w:hAnsi="Segoe UI Emoji" w:cs="Segoe UI Emoji"/>
+        </w:rPr>
+        <w:t>👋</w:t>
+      </w:r>
+    </w:p>
+    <w:p>
+      <w:pPr>
+        <w:spacing w:after="0"/>
+      </w:pPr>
+    </w:p>
+    <w:p>
+      <w:pPr>
+        <w:spacing w:after="0"/>
+      </w:pPr>
+      <w:r>
+        <w:t xml:space="preserve">Nous nous </w:t>
+      </w:r>
+      <w:r>
+        <w:t>Retrouvons</w:t>
+      </w:r>
+      <w:r>
+        <w:t xml:space="preserve"> </w:t>
+      </w:r>
+      <w:r>
+        <w:t>ce</w:t>
+      </w:r>
+      <w:r>
+        <w:t xml:space="preserve"> soir pour notre </w:t>
+      </w:r>
+      <w:r>
+        <w:rPr>
+          <w:b/>
+          <w:bCs/>
+        </w:rPr>
+        <w:t>Session 2 : Accompagnement D-CLIC</w:t>
+      </w:r>
+      <w:r>
+        <w:t>.</w:t>
+      </w:r>
+    </w:p>
+    <w:p>
+      <w:pPr>
+        <w:spacing w:after="0"/>
+      </w:pPr>
+    </w:p>
+    <w:p>
+      <w:pPr>
+        <w:spacing w:after="0"/>
+      </w:pPr>
+      <w:r>
+        <w:rPr>
+          <w:b/>
+          <w:bCs/>
+        </w:rPr>
+        <w:t>Rappel de la session :</w:t>
+      </w:r>
+    </w:p>
+    <w:p>
+      <w:pPr>
+        <w:numPr>
+          <w:ilvl w:val="0"/>
+          <w:numId w:val="19"/>
+        </w:numPr>
+        <w:spacing w:after="0"/>
+        <w:rPr>
+          <w:lang w:val="en-US"/>
+        </w:rPr>
+      </w:pPr>
+      <w:r>
+        <w:rPr>
+          <w:b/>
+          <w:bCs/>
+          <w:lang w:val="en-US"/>
+        </w:rPr>
+        <w:t xml:space="preserve">Lien Google </w:t>
+      </w:r>
+      <w:r>
+        <w:rPr>
+          <w:b/>
+          <w:bCs/>
+          <w:lang w:val="en-US"/>
+        </w:rPr>
+        <w:t>Meet:</w:t>
+      </w:r>
+      <w:r>
+        <w:rPr>
+          <w:lang w:val="en-US"/>
+        </w:rPr>
+        <w:t xml:space="preserve"> </w:t>
+      </w:r>
+      <w:hyperlink r:id="rId12" w:tgtFrame="_blank" w:history="1">
+        <w:r>
+          <w:rPr>
+            <w:rStyle w:val="Lienhypertexte"/>
+            <w:lang w:val="en-US"/>
+          </w:rPr>
+          <w:t>https://</w:t>
+        </w:r>
+        <w:proofErr w:type="spellStart"/>
+        <w:r>
+          <w:rPr>
+            <w:rStyle w:val="Lienhypertexte"/>
+            <w:lang w:val="en-US"/>
+          </w:rPr>
+          <w:t>meet.google.com</w:t>
+        </w:r>
+        <w:proofErr w:type="spellEnd"/>
+        <w:r>
+          <w:rPr>
+            <w:rStyle w:val="Lienhypertexte"/>
+            <w:lang w:val="en-US"/>
+          </w:rPr>
+          <w:t>/</w:t>
+        </w:r>
+        <w:proofErr w:type="spellStart"/>
+        <w:r>
+          <w:rPr>
+            <w:rStyle w:val="Lienhypertexte"/>
+            <w:lang w:val="en-US"/>
+          </w:rPr>
+          <w:t>ufe-mvnm-fxk</w:t>
+        </w:r>
+        <w:proofErr w:type="spellEnd"/>
+      </w:hyperlink>
+    </w:p>
+    <w:p>
+      <w:pPr>
+        <w:spacing w:after="0"/>
+        <w:ind w:left="720"/>
+        <w:rPr>
+          <w:lang w:val="en-US"/>
+        </w:rPr>
+      </w:pPr>
+    </w:p>
+    <w:p>
+      <w:pPr>
+        <w:spacing w:after="0"/>
+      </w:pPr>
+      <w:r>
+        <w:t xml:space="preserve">Un grand merci aux volontaires qui se sont positionnés pour animer les échanges d'aujourd'hui ! </w:t>
+      </w:r>
+    </w:p>
+    <w:p>
+      <w:pPr>
+        <w:spacing w:after="0"/>
+        <w:rPr>
+          <w:b/>
+          <w:bCs/>
+        </w:rPr>
+      </w:pPr>
+    </w:p>
+    <w:p>
+      <w:pPr>
+        <w:spacing w:after="0"/>
+      </w:pPr>
+      <w:r>
+        <w:rPr>
+          <w:b/>
+          <w:bCs/>
+        </w:rPr>
+        <w:t>Recommandations :</w:t>
+      </w:r>
+    </w:p>
+    <w:p>
+      <w:pPr>
+        <w:numPr>
+          <w:ilvl w:val="0"/>
+          <w:numId w:val="23"/>
+        </w:numPr>
+        <w:spacing w:after="0"/>
+      </w:pPr>
+      <w:r>
+        <w:t xml:space="preserve">Connectez-vous </w:t>
+      </w:r>
+      <w:r>
+        <w:rPr>
+          <w:b/>
+          <w:bCs/>
+        </w:rPr>
+        <w:t>5 minutes avant le début</w:t>
+      </w:r>
+      <w:r>
+        <w:t xml:space="preserve"> pour tester votre micro et votre caméra.</w:t>
+      </w:r>
+    </w:p>
+    <w:p>
+      <w:pPr>
+        <w:spacing w:after="0"/>
+      </w:pPr>
+    </w:p>
+    <w:p>
+      <w:pPr>
+        <w:spacing w:after="0"/>
+      </w:pPr>
+      <w:r>
+        <w:t>À</w:t>
+      </w:r>
+      <w:r>
+        <w:t xml:space="preserve"> tout à l'heure sur Meet ! </w:t>
       </w:r>
     </w:p>
     <w:p>
@@ -4966,6 +5210,155 @@
     </w:lvl>
   </w:abstractNum>
   <w:abstractNum w:abstractNumId="6" w15:restartNumberingAfterBreak="0">
+    <w:nsid w:val="25FF6F50"/>
+    <w:multiLevelType w:val="multilevel"/>
+    <w:tmpl w:val="1FFA2458"/>
+    <w:lvl w:ilvl="0">
+      <w:start w:val="1"/>
+      <w:numFmt w:val="bullet"/>
+      <w:lvlText w:val=""/>
+      <w:lvlJc w:val="left"/>
+      <w:pPr>
+        <w:tabs>
+          <w:tab w:val="num" w:pos="720"/>
+        </w:tabs>
+        <w:ind w:left="720" w:hanging="360"/>
+      </w:pPr>
+      <w:rPr>
+        <w:rFonts w:ascii="Symbol" w:hAnsi="Symbol" w:hint="default"/>
+        <w:sz w:val="20"/>
+      </w:rPr>
+    </w:lvl>
+    <w:lvl w:ilvl="1" w:tentative="1">
+      <w:start w:val="1"/>
+      <w:numFmt w:val="bullet"/>
+      <w:lvlText w:val="o"/>
+      <w:lvlJc w:val="left"/>
+      <w:pPr>
+        <w:tabs>
+          <w:tab w:val="num" w:pos="1440"/>
+        </w:tabs>
+        <w:ind w:left="1440" w:hanging="360"/>
+      </w:pPr>
+      <w:rPr>
+        <w:rFonts w:ascii="Courier New" w:hAnsi="Courier New" w:hint="default"/>
+        <w:sz w:val="20"/>
+      </w:rPr>
+    </w:lvl>
+    <w:lvl w:ilvl="2" w:tentative="1">
+      <w:start w:val="1"/>
+      <w:numFmt w:val="bullet"/>
+      <w:lvlText w:val=""/>
+      <w:lvlJc w:val="left"/>
+      <w:pPr>
+        <w:tabs>
+          <w:tab w:val="num" w:pos="2160"/>
+        </w:tabs>
+        <w:ind w:left="2160" w:hanging="360"/>
+      </w:pPr>
+      <w:rPr>
+        <w:rFonts w:ascii="Wingdings" w:hAnsi="Wingdings" w:hint="default"/>
+        <w:sz w:val="20"/>
+      </w:rPr>
+    </w:lvl>
+    <w:lvl w:ilvl="3" w:tentative="1">
+      <w:start w:val="1"/>
+      <w:numFmt w:val="bullet"/>
+      <w:lvlText w:val=""/>
+      <w:lvlJc w:val="left"/>
+      <w:pPr>
+        <w:tabs>
+          <w:tab w:val="num" w:pos="2880"/>
+        </w:tabs>
+        <w:ind w:left="2880" w:hanging="360"/>
+      </w:pPr>
+      <w:rPr>
+        <w:rFonts w:ascii="Wingdings" w:hAnsi="Wingdings" w:hint="default"/>
+        <w:sz w:val="20"/>
+      </w:rPr>
+    </w:lvl>
+    <w:lvl w:ilvl="4" w:tentative="1">
+      <w:start w:val="1"/>
+      <w:numFmt w:val="bullet"/>
+      <w:lvlText w:val=""/>
+      <w:lvlJc w:val="left"/>
+      <w:pPr>
+        <w:tabs>
+          <w:tab w:val="num" w:pos="3600"/>
+        </w:tabs>
+        <w:ind w:left="3600" w:hanging="360"/>
+      </w:pPr>
+      <w:rPr>
+        <w:rFonts w:ascii="Wingdings" w:hAnsi="Wingdings" w:hint="default"/>
+        <w:sz w:val="20"/>
+      </w:rPr>
+    </w:lvl>
+    <w:lvl w:ilvl="5" w:tentative="1">
+      <w:start w:val="1"/>
+      <w:numFmt w:val="bullet"/>
+      <w:lvlText w:val=""/>
+      <w:lvlJc w:val="left"/>
+      <w:pPr>
+        <w:tabs>
+          <w:tab w:val="num" w:pos="4320"/>
+        </w:tabs>
+        <w:ind w:left="4320" w:hanging="360"/>
+      </w:pPr>
+      <w:rPr>
+        <w:rFonts w:ascii="Wingdings" w:hAnsi="Wingdings" w:hint="default"/>
+        <w:sz w:val="20"/>
+      </w:rPr>
+    </w:lvl>
+    <w:lvl w:ilvl="6" w:tentative="1">
+      <w:start w:val="1"/>
+      <w:numFmt w:val="bullet"/>
+      <w:lvlText w:val=""/>
+      <w:lvlJc w:val="left"/>
+      <w:pPr>
+        <w:tabs>
+          <w:tab w:val="num" w:pos="5040"/>
+        </w:tabs>
+        <w:ind w:left="5040" w:hanging="360"/>
+      </w:pPr>
+      <w:rPr>
+        <w:rFonts w:ascii="Wingdings" w:hAnsi="Wingdings" w:hint="default"/>
+        <w:sz w:val="20"/>
+      </w:rPr>
+    </w:lvl>
+    <w:lvl w:ilvl="7" w:tentative="1">
+      <w:start w:val="1"/>
+      <w:numFmt w:val="bullet"/>
+      <w:lvlText w:val=""/>
+      <w:lvlJc w:val="left"/>
+      <w:pPr>
+        <w:tabs>
+          <w:tab w:val="num" w:pos="5760"/>
+        </w:tabs>
+        <w:ind w:left="5760" w:hanging="360"/>
+      </w:pPr>
+      <w:rPr>
+        <w:rFonts w:ascii="Wingdings" w:hAnsi="Wingdings" w:hint="default"/>
+        <w:sz w:val="20"/>
+      </w:rPr>
+    </w:lvl>
+    <w:lvl w:ilvl="8" w:tentative="1">
+      <w:start w:val="1"/>
+      <w:numFmt w:val="bullet"/>
+      <w:lvlText w:val=""/>
+      <w:lvlJc w:val="left"/>
+      <w:pPr>
+        <w:tabs>
+          <w:tab w:val="num" w:pos="6480"/>
+        </w:tabs>
+        <w:ind w:left="6480" w:hanging="360"/>
+      </w:pPr>
+      <w:rPr>
+        <w:rFonts w:ascii="Wingdings" w:hAnsi="Wingdings" w:hint="default"/>
+        <w:sz w:val="20"/>
+      </w:rPr>
+    </w:lvl>
+  </w:abstractNum>
+  <w:abstractNum w:abstractNumId="7" w15:restartNumberingAfterBreak="0">
     <w:nsid w:val="331A2158"/>
     <w:multiLevelType w:val="multilevel"/>
     <w:tmpl w:val="A4F61918"/>
@@ -5114,7 +5507,7 @@
       </w:rPr>
     </w:lvl>
   </w:abstractNum>
-  <w:abstractNum w:abstractNumId="7" w15:restartNumberingAfterBreak="0">
+  <w:abstractNum w:abstractNumId="8" w15:restartNumberingAfterBreak="0">
     <w:nsid w:val="3FD8036F"/>
     <w:multiLevelType w:val="multilevel"/>
     <w:tmpl w:val="C7AA5528"/>
@@ -5263,7 +5656,7 @@
       </w:rPr>
     </w:lvl>
   </w:abstractNum>
-  <w:abstractNum w:abstractNumId="8" w15:restartNumberingAfterBreak="0">
+  <w:abstractNum w:abstractNumId="9" w15:restartNumberingAfterBreak="0">
     <w:nsid w:val="4A8B6C26"/>
     <w:multiLevelType w:val="multilevel"/>
     <w:tmpl w:val="69F2D69E"/>
@@ -5412,7 +5805,7 @@
       </w:rPr>
     </w:lvl>
   </w:abstractNum>
-  <w:abstractNum w:abstractNumId="9" w15:restartNumberingAfterBreak="0">
+  <w:abstractNum w:abstractNumId="10" w15:restartNumberingAfterBreak="0">
     <w:nsid w:val="4C855D6D"/>
     <w:multiLevelType w:val="multilevel"/>
     <w:tmpl w:val="F67C7C50"/>
@@ -5561,7 +5954,7 @@
       </w:rPr>
     </w:lvl>
   </w:abstractNum>
-  <w:abstractNum w:abstractNumId="10" w15:restartNumberingAfterBreak="0">
+  <w:abstractNum w:abstractNumId="11" w15:restartNumberingAfterBreak="0">
     <w:nsid w:val="4D8231ED"/>
     <w:multiLevelType w:val="hybridMultilevel"/>
     <w:tmpl w:val="071CFB6C"/>
@@ -5674,7 +6067,7 @@
       </w:rPr>
     </w:lvl>
   </w:abstractNum>
-  <w:abstractNum w:abstractNumId="11" w15:restartNumberingAfterBreak="0">
+  <w:abstractNum w:abstractNumId="12" w15:restartNumberingAfterBreak="0">
     <w:nsid w:val="4DD231BE"/>
     <w:multiLevelType w:val="multilevel"/>
     <w:tmpl w:val="064A8864"/>
@@ -5787,7 +6180,156 @@
       </w:pPr>
     </w:lvl>
   </w:abstractNum>
-  <w:abstractNum w:abstractNumId="12" w15:restartNumberingAfterBreak="0">
+  <w:abstractNum w:abstractNumId="13" w15:restartNumberingAfterBreak="0">
+    <w:nsid w:val="50757118"/>
+    <w:multiLevelType w:val="multilevel"/>
+    <w:tmpl w:val="093CC414"/>
+    <w:lvl w:ilvl="0">
+      <w:start w:val="1"/>
+      <w:numFmt w:val="bullet"/>
+      <w:lvlText w:val=""/>
+      <w:lvlJc w:val="left"/>
+      <w:pPr>
+        <w:tabs>
+          <w:tab w:val="num" w:pos="720"/>
+        </w:tabs>
+        <w:ind w:left="720" w:hanging="360"/>
+      </w:pPr>
+      <w:rPr>
+        <w:rFonts w:ascii="Symbol" w:hAnsi="Symbol" w:hint="default"/>
+        <w:sz w:val="20"/>
+      </w:rPr>
+    </w:lvl>
+    <w:lvl w:ilvl="1" w:tentative="1">
+      <w:start w:val="1"/>
+      <w:numFmt w:val="bullet"/>
+      <w:lvlText w:val="o"/>
+      <w:lvlJc w:val="left"/>
+      <w:pPr>
+        <w:tabs>
+          <w:tab w:val="num" w:pos="1440"/>
+        </w:tabs>
+        <w:ind w:left="1440" w:hanging="360"/>
+      </w:pPr>
+      <w:rPr>
+        <w:rFonts w:ascii="Courier New" w:hAnsi="Courier New" w:hint="default"/>
+        <w:sz w:val="20"/>
+      </w:rPr>
+    </w:lvl>
+    <w:lvl w:ilvl="2" w:tentative="1">
+      <w:start w:val="1"/>
+      <w:numFmt w:val="bullet"/>
+      <w:lvlText w:val=""/>
+      <w:lvlJc w:val="left"/>
+      <w:pPr>
+        <w:tabs>
+          <w:tab w:val="num" w:pos="2160"/>
+        </w:tabs>
+        <w:ind w:left="2160" w:hanging="360"/>
+      </w:pPr>
+      <w:rPr>
+        <w:rFonts w:ascii="Wingdings" w:hAnsi="Wingdings" w:hint="default"/>
+        <w:sz w:val="20"/>
+      </w:rPr>
+    </w:lvl>
+    <w:lvl w:ilvl="3" w:tentative="1">
+      <w:start w:val="1"/>
+      <w:numFmt w:val="bullet"/>
+      <w:lvlText w:val=""/>
+      <w:lvlJc w:val="left"/>
+      <w:pPr>
+        <w:tabs>
+          <w:tab w:val="num" w:pos="2880"/>
+        </w:tabs>
+        <w:ind w:left="2880" w:hanging="360"/>
+      </w:pPr>
+      <w:rPr>
+        <w:rFonts w:ascii="Wingdings" w:hAnsi="Wingdings" w:hint="default"/>
+        <w:sz w:val="20"/>
+      </w:rPr>
+    </w:lvl>
+    <w:lvl w:ilvl="4" w:tentative="1">
+      <w:start w:val="1"/>
+      <w:numFmt w:val="bullet"/>
+      <w:lvlText w:val=""/>
+      <w:lvlJc w:val="left"/>
+      <w:pPr>
+        <w:tabs>
+          <w:tab w:val="num" w:pos="3600"/>
+        </w:tabs>
+        <w:ind w:left="3600" w:hanging="360"/>
+      </w:pPr>
+      <w:rPr>
+        <w:rFonts w:ascii="Wingdings" w:hAnsi="Wingdings" w:hint="default"/>
+        <w:sz w:val="20"/>
+      </w:rPr>
+    </w:lvl>
+    <w:lvl w:ilvl="5" w:tentative="1">
+      <w:start w:val="1"/>
+      <w:numFmt w:val="bullet"/>
+      <w:lvlText w:val=""/>
+      <w:lvlJc w:val="left"/>
+      <w:pPr>
+        <w:tabs>
+          <w:tab w:val="num" w:pos="4320"/>
+        </w:tabs>
+        <w:ind w:left="4320" w:hanging="360"/>
+      </w:pPr>
+      <w:rPr>
+        <w:rFonts w:ascii="Wingdings" w:hAnsi="Wingdings" w:hint="default"/>
+        <w:sz w:val="20"/>
+      </w:rPr>
+    </w:lvl>
+    <w:lvl w:ilvl="6" w:tentative="1">
+      <w:start w:val="1"/>
+      <w:numFmt w:val="bullet"/>
+      <w:lvlText w:val=""/>
+      <w:lvlJc w:val="left"/>
+      <w:pPr>
+        <w:tabs>
+          <w:tab w:val="num" w:pos="5040"/>
+        </w:tabs>
+        <w:ind w:left="5040" w:hanging="360"/>
+      </w:pPr>
+      <w:rPr>
+        <w:rFonts w:ascii="Wingdings" w:hAnsi="Wingdings" w:hint="default"/>
+        <w:sz w:val="20"/>
+      </w:rPr>
+    </w:lvl>
+    <w:lvl w:ilvl="7" w:tentative="1">
+      <w:start w:val="1"/>
+      <w:numFmt w:val="bullet"/>
+      <w:lvlText w:val=""/>
+      <w:lvlJc w:val="left"/>
+      <w:pPr>
+        <w:tabs>
+          <w:tab w:val="num" w:pos="5760"/>
+        </w:tabs>
+        <w:ind w:left="5760" w:hanging="360"/>
+      </w:pPr>
+      <w:rPr>
+        <w:rFonts w:ascii="Wingdings" w:hAnsi="Wingdings" w:hint="default"/>
+        <w:sz w:val="20"/>
+      </w:rPr>
+    </w:lvl>
+    <w:lvl w:ilvl="8" w:tentative="1">
+      <w:start w:val="1"/>
+      <w:numFmt w:val="bullet"/>
+      <w:lvlText w:val=""/>
+      <w:lvlJc w:val="left"/>
+      <w:pPr>
+        <w:tabs>
+          <w:tab w:val="num" w:pos="6480"/>
+        </w:tabs>
+        <w:ind w:left="6480" w:hanging="360"/>
+      </w:pPr>
+      <w:rPr>
+        <w:rFonts w:ascii="Wingdings" w:hAnsi="Wingdings" w:hint="default"/>
+        <w:sz w:val="20"/>
+      </w:rPr>
+    </w:lvl>
+  </w:abstractNum>
+  <w:abstractNum w:abstractNumId="14" w15:restartNumberingAfterBreak="0">
     <w:nsid w:val="53C31F57"/>
     <w:multiLevelType w:val="multilevel"/>
     <w:tmpl w:val="ED70682C"/>
@@ -5900,7 +6442,7 @@
       </w:pPr>
     </w:lvl>
   </w:abstractNum>
-  <w:abstractNum w:abstractNumId="13" w15:restartNumberingAfterBreak="0">
+  <w:abstractNum w:abstractNumId="15" w15:restartNumberingAfterBreak="0">
     <w:nsid w:val="5F4947B8"/>
     <w:multiLevelType w:val="multilevel"/>
     <w:tmpl w:val="417A38DC"/>
@@ -6049,7 +6591,7 @@
       </w:rPr>
     </w:lvl>
   </w:abstractNum>
-  <w:abstractNum w:abstractNumId="14" w15:restartNumberingAfterBreak="0">
+  <w:abstractNum w:abstractNumId="16" w15:restartNumberingAfterBreak="0">
     <w:nsid w:val="656C2A6D"/>
     <w:multiLevelType w:val="multilevel"/>
     <w:tmpl w:val="993AB654"/>
@@ -6198,7 +6740,7 @@
       </w:rPr>
     </w:lvl>
   </w:abstractNum>
-  <w:abstractNum w:abstractNumId="15" w15:restartNumberingAfterBreak="0">
+  <w:abstractNum w:abstractNumId="17" w15:restartNumberingAfterBreak="0">
     <w:nsid w:val="6ADF4C9C"/>
     <w:multiLevelType w:val="multilevel"/>
     <w:tmpl w:val="892CD2AA"/>
@@ -6311,7 +6853,156 @@
       </w:pPr>
     </w:lvl>
   </w:abstractNum>
-  <w:abstractNum w:abstractNumId="16" w15:restartNumberingAfterBreak="0">
+  <w:abstractNum w:abstractNumId="18" w15:restartNumberingAfterBreak="0">
+    <w:nsid w:val="6EE2254D"/>
+    <w:multiLevelType w:val="multilevel"/>
+    <w:tmpl w:val="60BEB028"/>
+    <w:lvl w:ilvl="0">
+      <w:start w:val="1"/>
+      <w:numFmt w:val="bullet"/>
+      <w:lvlText w:val=""/>
+      <w:lvlJc w:val="left"/>
+      <w:pPr>
+        <w:tabs>
+          <w:tab w:val="num" w:pos="720"/>
+        </w:tabs>
+        <w:ind w:left="720" w:hanging="360"/>
+      </w:pPr>
+      <w:rPr>
+        <w:rFonts w:ascii="Symbol" w:hAnsi="Symbol" w:hint="default"/>
+        <w:sz w:val="20"/>
+      </w:rPr>
+    </w:lvl>
+    <w:lvl w:ilvl="1" w:tentative="1">
+      <w:start w:val="1"/>
+      <w:numFmt w:val="bullet"/>
+      <w:lvlText w:val="o"/>
+      <w:lvlJc w:val="left"/>
+      <w:pPr>
+        <w:tabs>
+          <w:tab w:val="num" w:pos="1440"/>
+        </w:tabs>
+        <w:ind w:left="1440" w:hanging="360"/>
+      </w:pPr>
+      <w:rPr>
+        <w:rFonts w:ascii="Courier New" w:hAnsi="Courier New" w:hint="default"/>
+        <w:sz w:val="20"/>
+      </w:rPr>
+    </w:lvl>
+    <w:lvl w:ilvl="2" w:tentative="1">
+      <w:start w:val="1"/>
+      <w:numFmt w:val="bullet"/>
+      <w:lvlText w:val=""/>
+      <w:lvlJc w:val="left"/>
+      <w:pPr>
+        <w:tabs>
+          <w:tab w:val="num" w:pos="2160"/>
+        </w:tabs>
+        <w:ind w:left="2160" w:hanging="360"/>
+      </w:pPr>
+      <w:rPr>
+        <w:rFonts w:ascii="Wingdings" w:hAnsi="Wingdings" w:hint="default"/>
+        <w:sz w:val="20"/>
+      </w:rPr>
+    </w:lvl>
+    <w:lvl w:ilvl="3" w:tentative="1">
+      <w:start w:val="1"/>
+      <w:numFmt w:val="bullet"/>
+      <w:lvlText w:val=""/>
+      <w:lvlJc w:val="left"/>
+      <w:pPr>
+        <w:tabs>
+          <w:tab w:val="num" w:pos="2880"/>
+        </w:tabs>
+        <w:ind w:left="2880" w:hanging="360"/>
+      </w:pPr>
+      <w:rPr>
+        <w:rFonts w:ascii="Wingdings" w:hAnsi="Wingdings" w:hint="default"/>
+        <w:sz w:val="20"/>
+      </w:rPr>
+    </w:lvl>
+    <w:lvl w:ilvl="4" w:tentative="1">
+      <w:start w:val="1"/>
+      <w:numFmt w:val="bullet"/>
+      <w:lvlText w:val=""/>
+      <w:lvlJc w:val="left"/>
+      <w:pPr>
+        <w:tabs>
+          <w:tab w:val="num" w:pos="3600"/>
+        </w:tabs>
+        <w:ind w:left="3600" w:hanging="360"/>
+      </w:pPr>
+      <w:rPr>
+        <w:rFonts w:ascii="Wingdings" w:hAnsi="Wingdings" w:hint="default"/>
+        <w:sz w:val="20"/>
+      </w:rPr>
+    </w:lvl>
+    <w:lvl w:ilvl="5" w:tentative="1">
+      <w:start w:val="1"/>
+      <w:numFmt w:val="bullet"/>
+      <w:lvlText w:val=""/>
+      <w:lvlJc w:val="left"/>
+      <w:pPr>
+        <w:tabs>
+          <w:tab w:val="num" w:pos="4320"/>
+        </w:tabs>
+        <w:ind w:left="4320" w:hanging="360"/>
+      </w:pPr>
+      <w:rPr>
+        <w:rFonts w:ascii="Wingdings" w:hAnsi="Wingdings" w:hint="default"/>
+        <w:sz w:val="20"/>
+      </w:rPr>
+    </w:lvl>
+    <w:lvl w:ilvl="6" w:tentative="1">
+      <w:start w:val="1"/>
+      <w:numFmt w:val="bullet"/>
+      <w:lvlText w:val=""/>
+      <w:lvlJc w:val="left"/>
+      <w:pPr>
+        <w:tabs>
+          <w:tab w:val="num" w:pos="5040"/>
+        </w:tabs>
+        <w:ind w:left="5040" w:hanging="360"/>
+      </w:pPr>
+      <w:rPr>
+        <w:rFonts w:ascii="Wingdings" w:hAnsi="Wingdings" w:hint="default"/>
+        <w:sz w:val="20"/>
+      </w:rPr>
+    </w:lvl>
+    <w:lvl w:ilvl="7" w:tentative="1">
+      <w:start w:val="1"/>
+      <w:numFmt w:val="bullet"/>
+      <w:lvlText w:val=""/>
+      <w:lvlJc w:val="left"/>
+      <w:pPr>
+        <w:tabs>
+          <w:tab w:val="num" w:pos="5760"/>
+        </w:tabs>
+        <w:ind w:left="5760" w:hanging="360"/>
+      </w:pPr>
+      <w:rPr>
+        <w:rFonts w:ascii="Wingdings" w:hAnsi="Wingdings" w:hint="default"/>
+        <w:sz w:val="20"/>
+      </w:rPr>
+    </w:lvl>
+    <w:lvl w:ilvl="8" w:tentative="1">
+      <w:start w:val="1"/>
+      <w:numFmt w:val="bullet"/>
+      <w:lvlText w:val=""/>
+      <w:lvlJc w:val="left"/>
+      <w:pPr>
+        <w:tabs>
+          <w:tab w:val="num" w:pos="6480"/>
+        </w:tabs>
+        <w:ind w:left="6480" w:hanging="360"/>
+      </w:pPr>
+      <w:rPr>
+        <w:rFonts w:ascii="Wingdings" w:hAnsi="Wingdings" w:hint="default"/>
+        <w:sz w:val="20"/>
+      </w:rPr>
+    </w:lvl>
+  </w:abstractNum>
+  <w:abstractNum w:abstractNumId="19" w15:restartNumberingAfterBreak="0">
     <w:nsid w:val="70D86792"/>
     <w:multiLevelType w:val="multilevel"/>
     <w:tmpl w:val="13F4D2C4"/>
@@ -6460,7 +7151,120 @@
       </w:rPr>
     </w:lvl>
   </w:abstractNum>
-  <w:abstractNum w:abstractNumId="17" w15:restartNumberingAfterBreak="0">
+  <w:abstractNum w:abstractNumId="20" w15:restartNumberingAfterBreak="0">
+    <w:nsid w:val="75533296"/>
+    <w:multiLevelType w:val="multilevel"/>
+    <w:tmpl w:val="E984F696"/>
+    <w:lvl w:ilvl="0">
+      <w:start w:val="1"/>
+      <w:numFmt w:val="decimal"/>
+      <w:lvlText w:val="%1."/>
+      <w:lvlJc w:val="left"/>
+      <w:pPr>
+        <w:tabs>
+          <w:tab w:val="num" w:pos="720"/>
+        </w:tabs>
+        <w:ind w:left="720" w:hanging="360"/>
+      </w:pPr>
+    </w:lvl>
+    <w:lvl w:ilvl="1" w:tentative="1">
+      <w:start w:val="1"/>
+      <w:numFmt w:val="decimal"/>
+      <w:lvlText w:val="%2."/>
+      <w:lvlJc w:val="left"/>
+      <w:pPr>
+        <w:tabs>
+          <w:tab w:val="num" w:pos="1440"/>
+        </w:tabs>
+        <w:ind w:left="1440" w:hanging="360"/>
+      </w:pPr>
+    </w:lvl>
+    <w:lvl w:ilvl="2" w:tentative="1">
+      <w:start w:val="1"/>
+      <w:numFmt w:val="decimal"/>
+      <w:lvlText w:val="%3."/>
+      <w:lvlJc w:val="left"/>
+      <w:pPr>
+        <w:tabs>
+          <w:tab w:val="num" w:pos="2160"/>
+        </w:tabs>
+        <w:ind w:left="2160" w:hanging="360"/>
+      </w:pPr>
+    </w:lvl>
+    <w:lvl w:ilvl="3" w:tentative="1">
+      <w:start w:val="1"/>
+      <w:numFmt w:val="decimal"/>
+      <w:lvlText w:val="%4."/>
+      <w:lvlJc w:val="left"/>
+      <w:pPr>
+        <w:tabs>
+          <w:tab w:val="num" w:pos="2880"/>
+        </w:tabs>
+        <w:ind w:left="2880" w:hanging="360"/>
+      </w:pPr>
+    </w:lvl>
+    <w:lvl w:ilvl="4" w:tentative="1">
+      <w:start w:val="1"/>
+      <w:numFmt w:val="decimal"/>
+      <w:lvlText w:val="%5."/>
+      <w:lvlJc w:val="left"/>
+      <w:pPr>
+        <w:tabs>
+          <w:tab w:val="num" w:pos="3600"/>
+        </w:tabs>
+        <w:ind w:left="3600" w:hanging="360"/>
+      </w:pPr>
+    </w:lvl>
+    <w:lvl w:ilvl="5" w:tentative="1">
+      <w:start w:val="1"/>
+      <w:numFmt w:val="decimal"/>
+      <w:lvlText w:val="%6."/>
+      <w:lvlJc w:val="left"/>
+      <w:pPr>
+        <w:tabs>
+          <w:tab w:val="num" w:pos="4320"/>
+        </w:tabs>
+        <w:ind w:left="4320" w:hanging="360"/>
+      </w:pPr>
+    </w:lvl>
+    <w:lvl w:ilvl="6" w:tentative="1">
+      <w:start w:val="1"/>
+      <w:numFmt w:val="decimal"/>
+      <w:lvlText w:val="%7."/>
+      <w:lvlJc w:val="left"/>
+      <w:pPr>
+        <w:tabs>
+          <w:tab w:val="num" w:pos="5040"/>
+        </w:tabs>
+        <w:ind w:left="5040" w:hanging="360"/>
+      </w:pPr>
+    </w:lvl>
+    <w:lvl w:ilvl="7" w:tentative="1">
+      <w:start w:val="1"/>
+      <w:numFmt w:val="decimal"/>
+      <w:lvlText w:val="%8."/>
+      <w:lvlJc w:val="left"/>
+      <w:pPr>
+        <w:tabs>
+          <w:tab w:val="num" w:pos="5760"/>
+        </w:tabs>
+        <w:ind w:left="5760" w:hanging="360"/>
+      </w:pPr>
+    </w:lvl>
+    <w:lvl w:ilvl="8" w:tentative="1">
+      <w:start w:val="1"/>
+      <w:numFmt w:val="decimal"/>
+      <w:lvlText w:val="%9."/>
+      <w:lvlJc w:val="left"/>
+      <w:pPr>
+        <w:tabs>
+          <w:tab w:val="num" w:pos="6480"/>
+        </w:tabs>
+        <w:ind w:left="6480" w:hanging="360"/>
+      </w:pPr>
+    </w:lvl>
+  </w:abstractNum>
+  <w:abstractNum w:abstractNumId="21" w15:restartNumberingAfterBreak="0">
     <w:nsid w:val="763763FF"/>
     <w:multiLevelType w:val="multilevel"/>
     <w:tmpl w:val="F1307330"/>
@@ -6607,40 +7411,153 @@
         <w:rFonts w:ascii="Wingdings" w:hAnsi="Wingdings" w:hint="default"/>
         <w:sz w:val="20"/>
       </w:rPr>
+    </w:lvl>
+  </w:abstractNum>
+  <w:abstractNum w:abstractNumId="22" w15:restartNumberingAfterBreak="0">
+    <w:nsid w:val="7A607DE9"/>
+    <w:multiLevelType w:val="multilevel"/>
+    <w:tmpl w:val="57780BF8"/>
+    <w:lvl w:ilvl="0">
+      <w:start w:val="1"/>
+      <w:numFmt w:val="decimal"/>
+      <w:lvlText w:val="%1."/>
+      <w:lvlJc w:val="left"/>
+      <w:pPr>
+        <w:tabs>
+          <w:tab w:val="num" w:pos="720"/>
+        </w:tabs>
+        <w:ind w:left="720" w:hanging="360"/>
+      </w:pPr>
+    </w:lvl>
+    <w:lvl w:ilvl="1" w:tentative="1">
+      <w:start w:val="1"/>
+      <w:numFmt w:val="decimal"/>
+      <w:lvlText w:val="%2."/>
+      <w:lvlJc w:val="left"/>
+      <w:pPr>
+        <w:tabs>
+          <w:tab w:val="num" w:pos="1440"/>
+        </w:tabs>
+        <w:ind w:left="1440" w:hanging="360"/>
+      </w:pPr>
+    </w:lvl>
+    <w:lvl w:ilvl="2" w:tentative="1">
+      <w:start w:val="1"/>
+      <w:numFmt w:val="decimal"/>
+      <w:lvlText w:val="%3."/>
+      <w:lvlJc w:val="left"/>
+      <w:pPr>
+        <w:tabs>
+          <w:tab w:val="num" w:pos="2160"/>
+        </w:tabs>
+        <w:ind w:left="2160" w:hanging="360"/>
+      </w:pPr>
+    </w:lvl>
+    <w:lvl w:ilvl="3" w:tentative="1">
+      <w:start w:val="1"/>
+      <w:numFmt w:val="decimal"/>
+      <w:lvlText w:val="%4."/>
+      <w:lvlJc w:val="left"/>
+      <w:pPr>
+        <w:tabs>
+          <w:tab w:val="num" w:pos="2880"/>
+        </w:tabs>
+        <w:ind w:left="2880" w:hanging="360"/>
+      </w:pPr>
+    </w:lvl>
+    <w:lvl w:ilvl="4" w:tentative="1">
+      <w:start w:val="1"/>
+      <w:numFmt w:val="decimal"/>
+      <w:lvlText w:val="%5."/>
+      <w:lvlJc w:val="left"/>
+      <w:pPr>
+        <w:tabs>
+          <w:tab w:val="num" w:pos="3600"/>
+        </w:tabs>
+        <w:ind w:left="3600" w:hanging="360"/>
+      </w:pPr>
+    </w:lvl>
+    <w:lvl w:ilvl="5" w:tentative="1">
+      <w:start w:val="1"/>
+      <w:numFmt w:val="decimal"/>
+      <w:lvlText w:val="%6."/>
+      <w:lvlJc w:val="left"/>
+      <w:pPr>
+        <w:tabs>
+          <w:tab w:val="num" w:pos="4320"/>
+        </w:tabs>
+        <w:ind w:left="4320" w:hanging="360"/>
+      </w:pPr>
+    </w:lvl>
+    <w:lvl w:ilvl="6" w:tentative="1">
+      <w:start w:val="1"/>
+      <w:numFmt w:val="decimal"/>
+      <w:lvlText w:val="%7."/>
+      <w:lvlJc w:val="left"/>
+      <w:pPr>
+        <w:tabs>
+          <w:tab w:val="num" w:pos="5040"/>
+        </w:tabs>
+        <w:ind w:left="5040" w:hanging="360"/>
+      </w:pPr>
+    </w:lvl>
+    <w:lvl w:ilvl="7" w:tentative="1">
+      <w:start w:val="1"/>
+      <w:numFmt w:val="decimal"/>
+      <w:lvlText w:val="%8."/>
+      <w:lvlJc w:val="left"/>
+      <w:pPr>
+        <w:tabs>
+          <w:tab w:val="num" w:pos="5760"/>
+        </w:tabs>
+        <w:ind w:left="5760" w:hanging="360"/>
+      </w:pPr>
+    </w:lvl>
+    <w:lvl w:ilvl="8" w:tentative="1">
+      <w:start w:val="1"/>
+      <w:numFmt w:val="decimal"/>
+      <w:lvlText w:val="%9."/>
+      <w:lvlJc w:val="left"/>
+      <w:pPr>
+        <w:tabs>
+          <w:tab w:val="num" w:pos="6480"/>
+        </w:tabs>
+        <w:ind w:left="6480" w:hanging="360"/>
+      </w:pPr>
     </w:lvl>
   </w:abstractNum>
   <w:num w:numId="1" w16cid:durableId="287932163">
     <w:abstractNumId w:val="3"/>
   </w:num>
   <w:num w:numId="2" w16cid:durableId="995108117">
-    <w:abstractNumId w:val="15"/>
+    <w:abstractNumId w:val="17"/>
   </w:num>
   <w:num w:numId="3" w16cid:durableId="547035632">
-    <w:abstractNumId w:val="7"/>
+    <w:abstractNumId w:val="8"/>
   </w:num>
   <w:num w:numId="4" w16cid:durableId="1223952803">
-    <w:abstractNumId w:val="9"/>
+    <w:abstractNumId w:val="10"/>
   </w:num>
   <w:num w:numId="5" w16cid:durableId="1816680925">
-    <w:abstractNumId w:val="12"/>
+    <w:abstractNumId w:val="14"/>
   </w:num>
   <w:num w:numId="6" w16cid:durableId="2140607121">
-    <w:abstractNumId w:val="8"/>
+    <w:abstractNumId w:val="9"/>
   </w:num>
   <w:num w:numId="7" w16cid:durableId="1565943111">
     <w:abstractNumId w:val="2"/>
   </w:num>
   <w:num w:numId="8" w16cid:durableId="698235373">
-    <w:abstractNumId w:val="14"/>
+    <w:abstractNumId w:val="16"/>
   </w:num>
   <w:num w:numId="9" w16cid:durableId="315106318">
-    <w:abstractNumId w:val="16"/>
+    <w:abstractNumId w:val="19"/>
   </w:num>
   <w:num w:numId="10" w16cid:durableId="1135102586">
-    <w:abstractNumId w:val="17"/>
+    <w:abstractNumId w:val="21"/>
   </w:num>
   <w:num w:numId="11" w16cid:durableId="1638027556">
-    <w:abstractNumId w:val="13"/>
+    <w:abstractNumId w:val="15"/>
   </w:num>
   <w:num w:numId="12" w16cid:durableId="1793861411">
     <w:abstractNumId w:val="1"/>
@@ -6649,19 +7566,34 @@
     <w:abstractNumId w:val="4"/>
   </w:num>
   <w:num w:numId="14" w16cid:durableId="2135251524">
-    <w:abstractNumId w:val="11"/>
+    <w:abstractNumId w:val="12"/>
   </w:num>
   <w:num w:numId="15" w16cid:durableId="561991639">
     <w:abstractNumId w:val="5"/>
   </w:num>
   <w:num w:numId="16" w16cid:durableId="224607545">
-    <w:abstractNumId w:val="6"/>
+    <w:abstractNumId w:val="7"/>
   </w:num>
   <w:num w:numId="17" w16cid:durableId="1658075935">
-    <w:abstractNumId w:val="10"/>
+    <w:abstractNumId w:val="11"/>
   </w:num>
   <w:num w:numId="18" w16cid:durableId="614292305">
     <w:abstractNumId w:val="0"/>
+  </w:num>
+  <w:num w:numId="19" w16cid:durableId="1131898049">
+    <w:abstractNumId w:val="18"/>
+  </w:num>
+  <w:num w:numId="20" w16cid:durableId="983200296">
+    <w:abstractNumId w:val="22"/>
+  </w:num>
+  <w:num w:numId="21" w16cid:durableId="1129127586">
+    <w:abstractNumId w:val="6"/>
+  </w:num>
+  <w:num w:numId="22" w16cid:durableId="1087387856">
+    <w:abstractNumId w:val="20"/>
+  </w:num>
+  <w:num w:numId="23" w16cid:durableId="1838840275">
+    <w:abstractNumId w:val="13"/>
   </w:num>
 </w:numbering>
 </file>

</xml_diff>